<commit_message>
Clase 2: ajustar material a la clase 1 sin JUnit
La clase 1 ahora es Java puro con gradle run. La guía de estudio, el
README, la presentación y la actividad ya no dan por sabido JUnit ni
PASSED/FAILED: los explican en una línea. La guía docente (fuera del
repo) revisa en la retroalimentación la salida de gradle run con los
4 casos de la clase Tienda.

Co-Authored-By: Claude Opus 5 (1M context) <noreply@anthropic.com>
Claude-Session: https://claude.ai/code/session_01L2JuF1iG72koPJkmuRWSzm
</commit_message>
<xml_diff>
--- a/material-de-apoyo/Clase2_Guia_Estudio_Screenplay_Web.docx
+++ b/material-de-apoyo/Clase2_Guia_Estudio_Screenplay_Web.docx
@@ -240,7 +240,20 @@
         <w:rPr>
           <w:b w:val="0"/>
         </w:rPr>
-        <w:t>En la clase 1 aprendiste a escribir clases, objetos y pruebas con JUnit. Hoy usamos eso para algo que se parece mucho más al trabajo diario de un analista de pruebas: automatizar una página web. El proyecto abre Chrome, entra a la tienda de práctica Sauce Demo, escribe un usuario y una clave, y revisa que la página responda lo que esperamos.</w:t>
+        <w:t xml:space="preserve">En la clase 1 escribiste clases y objetos en Java y ejecutaste tu programa con </w:t>
+      </w:r>
+      <w:r>
+        <w:rPr>
+          <w:rFonts w:ascii="Consolas" w:hAnsi="Consolas" w:eastAsia="Consolas"/>
+          <w:color w:val="003D7A"/>
+        </w:rPr>
+        <w:t>gradle run</w:t>
+      </w:r>
+      <w:r>
+        <w:rPr>
+          <w:b w:val="0"/>
+        </w:rPr>
+        <w:t>: el programa imprimía resultados y tú mirabas si estaban bien. Hoy damos el paso que hace un analista de pruebas: que la máquina revise sola. El proyecto abre Chrome, entra a la tienda de práctica Sauce Demo, escribe un usuario y una clave, y compara lo que muestra la página con lo que esperamos. Si coincide, la prueba pasa; si no, falla.</w:t>
       </w:r>
     </w:p>
     <w:p>
@@ -3317,7 +3330,7 @@
         <w:rPr>
           <w:b w:val="0"/>
         </w:rPr>
-        <w:t xml:space="preserve"> es el botón de arranque: le dice a JUnit que ejecute los features con Cucumber y dónde están los steps.</w:t>
+        <w:t xml:space="preserve"> es el botón de arranque: le dice a JUnit (el programa que ejecuta pruebas en Java) que corra los features con Cucumber y dónde están los steps.</w:t>
       </w:r>
     </w:p>
     <w:p>
@@ -3701,7 +3714,33 @@
         <w:rPr>
           <w:b w:val="0"/>
         </w:rPr>
-        <w:t xml:space="preserve">Abre PowerShell en la carpeta del proyecto (donde está </w:t>
+        <w:t xml:space="preserve">En la clase 1 usabas </w:t>
+      </w:r>
+      <w:r>
+        <w:rPr>
+          <w:rFonts w:ascii="Consolas" w:hAnsi="Consolas" w:eastAsia="Consolas"/>
+          <w:color w:val="003D7A"/>
+        </w:rPr>
+        <w:t>gradle run</w:t>
+      </w:r>
+      <w:r>
+        <w:rPr>
+          <w:b w:val="0"/>
+        </w:rPr>
+        <w:t xml:space="preserve"> para correr un programa. Aquí usamos </w:t>
+      </w:r>
+      <w:r>
+        <w:rPr>
+          <w:rFonts w:ascii="Consolas" w:hAnsi="Consolas" w:eastAsia="Consolas"/>
+          <w:color w:val="003D7A"/>
+        </w:rPr>
+        <w:t>gradle clean test</w:t>
+      </w:r>
+      <w:r>
+        <w:rPr>
+          <w:b w:val="0"/>
+        </w:rPr>
+        <w:t xml:space="preserve">, que ejecuta las pruebas. Abre PowerShell en la carpeta del proyecto (donde está </w:t>
       </w:r>
       <w:r>
         <w:rPr>
@@ -3887,9 +3926,29 @@
     <w:p>
       <w:r>
         <w:rPr>
+          <w:rFonts w:ascii="Consolas" w:hAnsi="Consolas" w:eastAsia="Consolas"/>
+          <w:color w:val="003D7A"/>
+        </w:rPr>
+        <w:t>PASSED</w:t>
+      </w:r>
+      <w:r>
+        <w:rPr>
           <w:b w:val="0"/>
         </w:rPr>
-        <w:t xml:space="preserve">La tarea </w:t>
+        <w:t xml:space="preserve"> quiere decir que el escenario pasó: todo lo que se validó coincidió. </w:t>
+      </w:r>
+      <w:r>
+        <w:rPr>
+          <w:rFonts w:ascii="Consolas" w:hAnsi="Consolas" w:eastAsia="Consolas"/>
+          <w:color w:val="003D7A"/>
+        </w:rPr>
+        <w:t>FAILED</w:t>
+      </w:r>
+      <w:r>
+        <w:rPr>
+          <w:b w:val="0"/>
+        </w:rPr>
+        <w:t xml:space="preserve"> quiere decir que algo no coincidió o no se pudo hacer. La tarea </w:t>
       </w:r>
       <w:r>
         <w:rPr>

</xml_diff>